<commit_message>
add karaoke, stick figure, move timeline, QR code, score meter, update GDD/TDD
</commit_message>
<xml_diff>
--- a/docs/dance_game_tdd.docx
+++ b/docs/dance_game_tdd.docx
@@ -601,11 +601,6 @@
           <w:rtl w:val="0"/>
         </w:rPr>
         <w:t xml:space="preserve">See after 17</w:t>
-      </w:r>
-      <w:r>
-        <w:rPr>
-          <w:rtl w:val="0"/>
-        </w:rPr>
       </w:r>
     </w:p>
     <w:p>
@@ -4592,7 +4587,7 @@
         <w:rPr>
           <w:rtl w:val="0"/>
         </w:rPr>
-        <w:t xml:space="preserve">Create the GitHub repository with the folder structure shown above.</w:t>
+        <w:t xml:space="preserve">[DONE] Create the GitHub repository with the folder structure shown above.</w:t>
       </w:r>
     </w:p>
     <w:p>
@@ -4612,7 +4607,7 @@
         <w:rPr>
           <w:rtl w:val="0"/>
         </w:rPr>
-        <w:t xml:space="preserve">Set up frontend and backend as separate runnable apps.</w:t>
+        <w:t xml:space="preserve">[DONE] Set up frontend and backend as separate runnable apps. Frontend on Vercel, backend on Railway.</w:t>
       </w:r>
     </w:p>
     <w:p>
@@ -4632,7 +4627,7 @@
         <w:rPr>
           <w:rtl w:val="0"/>
         </w:rPr>
-        <w:t xml:space="preserve">Implement one search endpoint and one hardcoded track.</w:t>
+        <w:t xml:space="preserve">[DONE] Implemented YouTube Data API v3 search endpoint and live track selection.</w:t>
       </w:r>
     </w:p>
     <w:p>
@@ -4652,7 +4647,7 @@
         <w:rPr>
           <w:rtl w:val="0"/>
         </w:rPr>
-        <w:t xml:space="preserve">Add one choreography JSON file and prove prompt scheduling works.</w:t>
+        <w:t xml:space="preserve">[DONE] Choreography JSON cached + deterministic procedural generator with phrase sections. Prompt scheduling live via 100ms polling.</w:t>
       </w:r>
     </w:p>
     <w:p>
@@ -4672,7 +4667,114 @@
         <w:rPr>
           <w:rtl w:val="0"/>
         </w:rPr>
-        <w:t xml:space="preserve">Connect a phone controller or simulated input source.</w:t>
+        <w:t xml:space="preserve">[DONE] Phone controller via QR code + Socket.io. DeviceMotion API streams accelerometer/gyro data.</w:t>
+      </w:r>
+    </w:p>
+    <w:p>
+      <w:pPr>
+        <w:pStyle w:val="Heading1"/>
+        <w:rPr/>
+      </w:pPr>
+      <w:r>
+        <w:rPr>
+          <w:rtl w:val="0"/>
+        </w:rPr>
+        <w:t xml:space="preserve">20. Next Technical Milestones (v0.8+)</w:t>
+      </w:r>
+    </w:p>
+    <w:p>
+      <w:pPr>
+        <w:ind w:left="288" w:hanging="216"/>
+        <w:rPr/>
+      </w:pPr>
+      <w:r>
+        <w:rPr>
+          <w:b w:val="1"/>
+          <w:rtl w:val="0"/>
+        </w:rPr>
+        <w:t xml:space="preserve">• </w:t>
+      </w:r>
+      <w:r>
+        <w:rPr>
+          <w:rtl w:val="0"/>
+        </w:rPr>
+        <w:t xml:space="preserve">Integrate Musixmatch API for word-level synced karaoke lyrics (upgrade from LRCLIB line-level).</w:t>
+      </w:r>
+    </w:p>
+    <w:p>
+      <w:pPr>
+        <w:ind w:left="288" w:hanging="216"/>
+        <w:rPr/>
+      </w:pPr>
+      <w:r>
+        <w:rPr>
+          <w:b w:val="1"/>
+          <w:rtl w:val="0"/>
+        </w:rPr>
+        <w:t xml:space="preserve">• </w:t>
+      </w:r>
+      <w:r>
+        <w:rPr>
+          <w:rtl w:val="0"/>
+        </w:rPr>
+        <w:t xml:space="preserve">Wire up real motion scoring — map phone accelerometer gestures to move types and score them live.</w:t>
+      </w:r>
+    </w:p>
+    <w:p>
+      <w:pPr>
+        <w:ind w:left="288" w:hanging="216"/>
+        <w:rPr/>
+      </w:pPr>
+      <w:r>
+        <w:rPr>
+          <w:b w:val="1"/>
+          <w:rtl w:val="0"/>
+        </w:rPr>
+        <w:t xml:space="preserve">• </w:t>
+      </w:r>
+      <w:r>
+        <w:rPr>
+          <w:rtl w:val="0"/>
+        </w:rPr>
+        <w:t xml:space="preserve">Add multiplayer support — multiple phones connect to same session, individual score meters per player.</w:t>
+      </w:r>
+    </w:p>
+    <w:p>
+      <w:pPr>
+        <w:ind w:left="288" w:hanging="216"/>
+        <w:rPr/>
+      </w:pPr>
+      <w:r>
+        <w:rPr>
+          <w:b w:val="1"/>
+          <w:rtl w:val="0"/>
+        </w:rPr>
+        <w:t xml:space="preserve">• </w:t>
+      </w:r>
+      <w:r>
+        <w:rPr>
+          <w:rtl w:val="0"/>
+        </w:rPr>
+        <w:t xml:space="preserve">Animated stick figure — smooth CSS/SVG transitions between poses instead of instant snap.</w:t>
+      </w:r>
+    </w:p>
+    <w:p>
+      <w:pPr>
+        <w:ind w:left="288" w:hanging="216"/>
+        <w:rPr/>
+      </w:pPr>
+      <w:r>
+        <w:rPr>
+          <w:b w:val="1"/>
+          <w:rtl w:val="0"/>
+        </w:rPr>
+        <w:t xml:space="preserve">• </w:t>
+      </w:r>
+      <w:r>
+        <w:rPr>
+          <w:rtl w:val="0"/>
+        </w:rPr>
+        <w:t xml:space="preserve">Persist session results to database (replace in-memory session store with Postgres or Redis on Railway).</w:t>
       </w:r>
     </w:p>
     <w:sectPr>

</xml_diff>